<commit_message>
Atualizado os planos de ensino.
</commit_message>
<xml_diff>
--- a/Plano de ensino/Rubrica_Mestre_Projeto_Integrador.docx
+++ b/Plano de ensino/Rubrica_Mestre_Projeto_Integrador.docx
@@ -4184,29 +4184,29 @@
               <w:jc w:val="left"/>
             </w:pPr>
             <w:r>
-              <w:t xml:space="preserve">—</w:t>
-            </w:r>
-          </w:p>
-        </w:tc>
-        <w:tc>
-          <w:p>
-            <w:pPr>
-              <w:pStyle w:val="Compact"/>
-              <w:jc w:val="left"/>
-            </w:pPr>
-            <w:r>
-              <w:t xml:space="preserve">—</w:t>
-            </w:r>
-          </w:p>
-        </w:tc>
-        <w:tc>
-          <w:p>
-            <w:pPr>
-              <w:pStyle w:val="Compact"/>
-              <w:jc w:val="left"/>
-            </w:pPr>
-            <w:r>
-              <w:t xml:space="preserve">—</w:t>
+              <w:t xml:space="preserve">obs.</w:t>
+            </w:r>
+          </w:p>
+        </w:tc>
+        <w:tc>
+          <w:p>
+            <w:pPr>
+              <w:pStyle w:val="Compact"/>
+              <w:jc w:val="left"/>
+            </w:pPr>
+            <w:r>
+              <w:t xml:space="preserve">✓</w:t>
+            </w:r>
+          </w:p>
+        </w:tc>
+        <w:tc>
+          <w:p>
+            <w:pPr>
+              <w:pStyle w:val="Compact"/>
+              <w:jc w:val="left"/>
+            </w:pPr>
+            <w:r>
+              <w:t xml:space="preserve">✓</w:t>
             </w:r>
           </w:p>
         </w:tc>
@@ -5752,7 +5752,7 @@
               <w:jc w:val="left"/>
             </w:pPr>
             <w:r>
-              <w:t xml:space="preserve">✓ CF5–CF6</w:t>
+              <w:t xml:space="preserve">obs. CF2 / ✓ CF3–CF6</w:t>
             </w:r>
           </w:p>
         </w:tc>
@@ -6340,7 +6340,7 @@
         <w:rPr>
           <w:i/>
         </w:rPr>
-        <w:t xml:space="preserve">(CF5 e CF6)</w:t>
+        <w:t xml:space="preserve">(CF3 em diante)</w:t>
       </w:r>
       <w:r>
         <w:br/>

</xml_diff>